<commit_message>
Update agent metadata and GUI documentation
Replit-Commit-Author: Agent
</commit_message>
<xml_diff>
--- a/docs/GUIA_TD_APP.docx
+++ b/docs/GUIA_TD_APP.docx
@@ -5377,7 +5377,7 @@
       <w:spacing w:before="220" w:after="120"/>
     </w:pPr>
     <w:rPr>
-      <w:sz w:val="1E"/>
+      <w:sz w:val="36"/>
       <w:color w:val="7C3AED"/>
       <w:b/>
     </w:rPr>
@@ -5392,7 +5392,7 @@
       <w:spacing w:before="170" w:after="90"/>
     </w:pPr>
     <w:rPr>
-      <w:sz w:val="17"/>
+      <w:sz w:val="28"/>
       <w:color w:val="4C1D95"/>
       <w:b/>
     </w:rPr>
@@ -5407,7 +5407,7 @@
       <w:spacing w:before="130" w:after="70"/>
     </w:pPr>
     <w:rPr>
-      <w:sz w:val="14"/>
+      <w:sz w:val="24"/>
       <w:color w:val="14B8A6"/>
       <w:b/>
     </w:rPr>
@@ -5415,7 +5415,7 @@
   <w:style w:type="paragraph" w:styleId="CoverTitle">
     <w:name w:val="CoverTitle"/>
     <w:rPr>
-      <w:sz w:val="2D"/>
+      <w:sz w:val="56"/>
       <w:color w:val="4C1D95"/>
       <w:b/>
     </w:rPr>
@@ -5423,7 +5423,7 @@
   <w:style w:type="paragraph" w:styleId="CoverSubtitle">
     <w:name w:val="CoverSubtitle"/>
     <w:rPr>
-      <w:sz w:val="19"/>
+      <w:sz w:val="32"/>
       <w:color w:val="21123B"/>
       <w:b/>
     </w:rPr>
@@ -5431,7 +5431,7 @@
   <w:style w:type="paragraph" w:styleId="CoverMeta">
     <w:name w:val="CoverMeta"/>
     <w:rPr>
-      <w:sz w:val="11"/>
+      <w:sz w:val="22"/>
       <w:color w:val="6D647A"/>
       <w:b/>
     </w:rPr>
@@ -5439,7 +5439,7 @@
   <w:style w:type="paragraph" w:styleId="CoverTagline">
     <w:name w:val="CoverTagline"/>
     <w:rPr>
-      <w:sz w:val="12"/>
+      <w:sz w:val="24"/>
       <w:color w:val="7C3AED"/>
       <w:b/>
       <w:i/>
@@ -5448,7 +5448,7 @@
   <w:style w:type="paragraph" w:styleId="CoverLabel">
     <w:name w:val="CoverLabel"/>
     <w:rPr>
-      <w:sz w:val="10"/>
+      <w:sz w:val="20"/>
       <w:color w:val="14B8A6"/>
       <w:b/>
     </w:rPr>
@@ -5456,49 +5456,49 @@
   <w:style w:type="paragraph" w:styleId="TableCell">
     <w:name w:val="TableCell"/>
     <w:rPr>
-      <w:sz w:val="9"/>
+      <w:sz w:val="18"/>
       <w:color w:val="21123B"/>
     </w:rPr>
   </w:style>
   <w:style w:type="paragraph" w:styleId="TableHeader">
     <w:name w:val="TableHeader"/>
     <w:rPr>
-      <w:sz w:val="9"/>
+      <w:sz w:val="18"/>
       <w:color w:val="FFFFFF"/>
     </w:rPr>
   </w:style>
   <w:style w:type="paragraph" w:styleId="ListItem">
     <w:name w:val="ListItem"/>
     <w:rPr>
-      <w:sz w:val="11"/>
+      <w:sz w:val="22"/>
       <w:color w:val="21123B"/>
     </w:rPr>
   </w:style>
   <w:style w:type="paragraph" w:styleId="Quote">
     <w:name w:val="Quote"/>
     <w:rPr>
-      <w:sz w:val="11"/>
+      <w:sz w:val="22"/>
       <w:color w:val="21123B"/>
     </w:rPr>
   </w:style>
   <w:style w:type="paragraph" w:styleId="CodeBlock">
     <w:name w:val="CodeBlock"/>
     <w:rPr>
-      <w:sz w:val="9"/>
+      <w:sz w:val="18"/>
       <w:color w:val="4C1D95"/>
     </w:rPr>
   </w:style>
   <w:style w:type="paragraph" w:styleId="TOCLine">
     <w:name w:val="TOCLine"/>
     <w:rPr>
-      <w:sz w:val="11"/>
+      <w:sz w:val="22"/>
       <w:color w:val="4C1D95"/>
     </w:rPr>
   </w:style>
   <w:style w:type="paragraph" w:styleId="TOCNote">
     <w:name w:val="TOCNote"/>
     <w:rPr>
-      <w:sz w:val="10"/>
+      <w:sz w:val="20"/>
       <w:color w:val="6D647A"/>
     </w:rPr>
   </w:style>

</xml_diff>